<commit_message>
Update MiGA_Guide_2026: Section 6 revised with assembly vs raw reads input types, correct miga-cli new usage, and -D flag requirement
</commit_message>
<xml_diff>
--- a/SPECIFIC_GUIDES/MiGA_Guide_2026.docx
+++ b/SPECIFIC_GUIDES/MiGA_Guide_2026.docx
@@ -1953,16 +1953,7 @@
           <w:sz w:val="20"/>
           <w:szCs w:val="20"/>
         </w:rPr>
-        <w:t xml:space="preserve">⚠ </w:t>
-      </w:r>
-      <w:r>
-        <w:rPr>
-          <w:rFonts w:eastAsia="Arial" w:cs="Arial"/>
-          <w:color w:val="7F6000"/>
-          <w:sz w:val="20"/>
-          <w:szCs w:val="20"/>
-        </w:rPr>
-        <w:t>Note: Never run pixi run miga-cli init — it overwrites .miga_rc and .miga_modules with defaults, breaking all Pixi path configurations. Use pixi run miga-setup-vault-config instead.</w:t>
+        <w:t>⚠ Note: Never run pixi run miga-cli init — it overwrites .miga_rc and .miga_modules with defaults, breaking all Pixi path configurations. Use pixi run miga-setup-vault-config instead.</w:t>
       </w:r>
     </w:p>
     <w:p>
@@ -2352,16 +2343,7 @@
           <w:sz w:val="20"/>
           <w:szCs w:val="20"/>
         </w:rPr>
-        <w:t xml:space="preserve">✓ </w:t>
-      </w:r>
-      <w:r>
-        <w:rPr>
-          <w:rFonts w:eastAsia="Arial" w:cs="Arial"/>
-          <w:color w:val="375623"/>
-          <w:sz w:val="20"/>
-          <w:szCs w:val="20"/>
-        </w:rPr>
-        <w:t>Tip: All six steps only need to be run once. After that, MiGA is ready to use with pixi run miga commands.</w:t>
+        <w:t>✓ Tip: All six steps only need to be run once. After that, MiGA is ready to use with pixi run miga commands.</w:t>
       </w:r>
     </w:p>
     <w:p>
@@ -2578,16 +2560,7 @@
           <w:sz w:val="20"/>
           <w:szCs w:val="20"/>
         </w:rPr>
-        <w:t xml:space="preserve">⚠ </w:t>
-      </w:r>
-      <w:r>
-        <w:rPr>
-          <w:rFonts w:eastAsia="Arial" w:cs="Arial"/>
-          <w:color w:val="7F6000"/>
-          <w:sz w:val="20"/>
-          <w:szCs w:val="20"/>
-        </w:rPr>
-        <w:t>Note: After upgrading, always re-run pixi run miga-setup-vault-config to ensure .miga_rc and .miga_modules are correct for the new version.</w:t>
+        <w:t>⚠ Note: After upgrading, always re-run pixi run miga-setup-vault-config to ensure .miga_rc and .miga_modules are correct for the new version.</w:t>
       </w:r>
     </w:p>
     <w:p>
@@ -3244,16 +3217,7 @@
           <w:sz w:val="20"/>
           <w:szCs w:val="20"/>
         </w:rPr>
-        <w:t xml:space="preserve">✓ </w:t>
-      </w:r>
-      <w:r>
-        <w:rPr>
-          <w:rFonts w:eastAsia="Arial" w:cs="Arial"/>
-          <w:color w:val="375623"/>
-          <w:sz w:val="20"/>
-          <w:szCs w:val="20"/>
-        </w:rPr>
-        <w:t>Tip: When downloading TypeMat_Lite, the terminal may appear frozen for 5-10 minutes — especially during 09.distances which contains hundreds of thousands of small files. This is normal. Do not interrupt the process.</w:t>
+        <w:t>✓ Tip: When downloading TypeMat_Lite, the terminal may appear frozen for 5-10 minutes — especially during 09.distances which contains hundreds of thousands of small files. This is normal. Do not interrupt the process.</w:t>
       </w:r>
     </w:p>
     <w:p>
@@ -3408,16 +3372,7 @@
           <w:sz w:val="20"/>
           <w:szCs w:val="20"/>
         </w:rPr>
-        <w:t xml:space="preserve">⚠ </w:t>
-      </w:r>
-      <w:r>
-        <w:rPr>
-          <w:rFonts w:eastAsia="Arial" w:cs="Arial"/>
-          <w:color w:val="7F6000"/>
-          <w:sz w:val="20"/>
-          <w:szCs w:val="20"/>
-        </w:rPr>
-        <w:t>Note: MyTaxa scan is disabled by default (MIGA_MYTAXA=no in .miga_rc). Enable by changing to yes, but this adds significant run time.</w:t>
+        <w:t>⚠ Note: MyTaxa scan is disabled by default (MIGA_MYTAXA=no in .miga_rc). Enable by changing to yes, but this adds significant run time.</w:t>
       </w:r>
     </w:p>
     <w:p>
@@ -4090,70 +4045,43 @@
           <w:sz w:val="18"/>
           <w:szCs w:val="18"/>
         </w:rPr>
-        <w:t xml:space="preserve">  </w:t>
-      </w:r>
-      <w:r>
-        <w:rPr>
-          <w:rFonts w:eastAsia="Courier New" w:cs="Courier New" w:ascii="Courier New" w:hAnsi="Courier New"/>
-          <w:color w:val="1A1A1A"/>
-          <w:sz w:val="18"/>
-          <w:szCs w:val="18"/>
-        </w:rPr>
-        <w:t>--type genome \</w:t>
-      </w:r>
-    </w:p>
-    <w:p>
-      <w:pPr>
-        <w:pStyle w:val="Normal"/>
-        <w:shd w:val="clear" w:fill="F2F2F2"/>
-        <w:spacing w:before="60" w:after="60"/>
-        <w:ind w:left="360"/>
-        <w:rPr/>
-      </w:pPr>
-      <w:r>
-        <w:rPr>
-          <w:rFonts w:eastAsia="Courier New" w:cs="Courier New" w:ascii="Courier New" w:hAnsi="Courier New"/>
-          <w:color w:val="1A1A1A"/>
-          <w:sz w:val="18"/>
-          <w:szCs w:val="18"/>
-        </w:rPr>
-        <w:t xml:space="preserve">  </w:t>
-      </w:r>
-      <w:r>
-        <w:rPr>
-          <w:rFonts w:eastAsia="Courier New" w:cs="Courier New" w:ascii="Courier New" w:hAnsi="Courier New"/>
-          <w:color w:val="1A1A1A"/>
-          <w:sz w:val="18"/>
-          <w:szCs w:val="18"/>
-        </w:rPr>
-        <w:t>-o /path/to/output_dir \</w:t>
-      </w:r>
-    </w:p>
-    <w:p>
-      <w:pPr>
-        <w:pStyle w:val="Normal"/>
-        <w:shd w:val="clear" w:fill="F2F2F2"/>
-        <w:spacing w:before="60" w:after="60"/>
-        <w:ind w:left="360"/>
-        <w:rPr/>
-      </w:pPr>
-      <w:r>
-        <w:rPr>
-          <w:rFonts w:eastAsia="Courier New" w:cs="Courier New" w:ascii="Courier New" w:hAnsi="Courier New"/>
-          <w:color w:val="1A1A1A"/>
-          <w:sz w:val="18"/>
-          <w:szCs w:val="18"/>
-        </w:rPr>
-        <w:t xml:space="preserve">  </w:t>
-      </w:r>
-      <w:r>
-        <w:rPr>
-          <w:rFonts w:eastAsia="Courier New" w:cs="Courier New" w:ascii="Courier New" w:hAnsi="Courier New"/>
-          <w:color w:val="1A1A1A"/>
-          <w:sz w:val="18"/>
-          <w:szCs w:val="18"/>
-        </w:rPr>
-        <w:t>/path/to/genome.fasta</w:t>
+        <w:t xml:space="preserve">  --type genome \</w:t>
+      </w:r>
+    </w:p>
+    <w:p>
+      <w:pPr>
+        <w:pStyle w:val="Normal"/>
+        <w:shd w:val="clear" w:fill="F2F2F2"/>
+        <w:spacing w:before="60" w:after="60"/>
+        <w:ind w:left="360"/>
+        <w:rPr/>
+      </w:pPr>
+      <w:r>
+        <w:rPr>
+          <w:rFonts w:eastAsia="Courier New" w:cs="Courier New" w:ascii="Courier New" w:hAnsi="Courier New"/>
+          <w:color w:val="1A1A1A"/>
+          <w:sz w:val="18"/>
+          <w:szCs w:val="18"/>
+        </w:rPr>
+        <w:t xml:space="preserve">  -o /path/to/output_dir \</w:t>
+      </w:r>
+    </w:p>
+    <w:p>
+      <w:pPr>
+        <w:pStyle w:val="Normal"/>
+        <w:shd w:val="clear" w:fill="F2F2F2"/>
+        <w:spacing w:before="60" w:after="60"/>
+        <w:ind w:left="360"/>
+        <w:rPr/>
+      </w:pPr>
+      <w:r>
+        <w:rPr>
+          <w:rFonts w:eastAsia="Courier New" w:cs="Courier New" w:ascii="Courier New" w:hAnsi="Courier New"/>
+          <w:color w:val="1A1A1A"/>
+          <w:sz w:val="18"/>
+          <w:szCs w:val="18"/>
+        </w:rPr>
+        <w:t xml:space="preserve">  /path/to/genome.fasta</w:t>
       </w:r>
     </w:p>
     <w:p>
@@ -4346,70 +4274,43 @@
           <w:sz w:val="18"/>
           <w:szCs w:val="18"/>
         </w:rPr>
-        <w:t xml:space="preserve">  </w:t>
-      </w:r>
-      <w:r>
-        <w:rPr>
-          <w:rFonts w:eastAsia="Courier New" w:cs="Courier New" w:ascii="Courier New" w:hAnsi="Courier New"/>
-          <w:color w:val="1A1A1A"/>
-          <w:sz w:val="18"/>
-          <w:szCs w:val="18"/>
-        </w:rPr>
-        <w:t>--db-path $MIGA_HOME/TypeMat_Lite \</w:t>
-      </w:r>
-    </w:p>
-    <w:p>
-      <w:pPr>
-        <w:pStyle w:val="Normal"/>
-        <w:shd w:val="clear" w:fill="F2F2F2"/>
-        <w:spacing w:before="60" w:after="60"/>
-        <w:ind w:left="360"/>
-        <w:rPr/>
-      </w:pPr>
-      <w:r>
-        <w:rPr>
-          <w:rFonts w:eastAsia="Courier New" w:cs="Courier New" w:ascii="Courier New" w:hAnsi="Courier New"/>
-          <w:color w:val="1A1A1A"/>
-          <w:sz w:val="18"/>
-          <w:szCs w:val="18"/>
-        </w:rPr>
-        <w:t xml:space="preserve">  </w:t>
-      </w:r>
-      <w:r>
-        <w:rPr>
-          <w:rFonts w:eastAsia="Courier New" w:cs="Courier New" w:ascii="Courier New" w:hAnsi="Courier New"/>
-          <w:color w:val="1A1A1A"/>
-          <w:sz w:val="18"/>
-          <w:szCs w:val="18"/>
-        </w:rPr>
-        <w:t>-o /path/to/output_dir \</w:t>
-      </w:r>
-    </w:p>
-    <w:p>
-      <w:pPr>
-        <w:pStyle w:val="Normal"/>
-        <w:shd w:val="clear" w:fill="F2F2F2"/>
-        <w:spacing w:before="60" w:after="60"/>
-        <w:ind w:left="360"/>
-        <w:rPr/>
-      </w:pPr>
-      <w:r>
-        <w:rPr>
-          <w:rFonts w:eastAsia="Courier New" w:cs="Courier New" w:ascii="Courier New" w:hAnsi="Courier New"/>
-          <w:color w:val="1A1A1A"/>
-          <w:sz w:val="18"/>
-          <w:szCs w:val="18"/>
-        </w:rPr>
-        <w:t xml:space="preserve">  </w:t>
-      </w:r>
-      <w:r>
-        <w:rPr>
-          <w:rFonts w:eastAsia="Courier New" w:cs="Courier New" w:ascii="Courier New" w:hAnsi="Courier New"/>
-          <w:color w:val="1A1A1A"/>
-          <w:sz w:val="18"/>
-          <w:szCs w:val="18"/>
-        </w:rPr>
-        <w:t>/path/to/genome.fasta</w:t>
+        <w:t xml:space="preserve">  --db-path $MIGA_HOME/TypeMat_Lite \</w:t>
+      </w:r>
+    </w:p>
+    <w:p>
+      <w:pPr>
+        <w:pStyle w:val="Normal"/>
+        <w:shd w:val="clear" w:fill="F2F2F2"/>
+        <w:spacing w:before="60" w:after="60"/>
+        <w:ind w:left="360"/>
+        <w:rPr/>
+      </w:pPr>
+      <w:r>
+        <w:rPr>
+          <w:rFonts w:eastAsia="Courier New" w:cs="Courier New" w:ascii="Courier New" w:hAnsi="Courier New"/>
+          <w:color w:val="1A1A1A"/>
+          <w:sz w:val="18"/>
+          <w:szCs w:val="18"/>
+        </w:rPr>
+        <w:t xml:space="preserve">  -o /path/to/output_dir \</w:t>
+      </w:r>
+    </w:p>
+    <w:p>
+      <w:pPr>
+        <w:pStyle w:val="Normal"/>
+        <w:shd w:val="clear" w:fill="F2F2F2"/>
+        <w:spacing w:before="60" w:after="60"/>
+        <w:ind w:left="360"/>
+        <w:rPr/>
+      </w:pPr>
+      <w:r>
+        <w:rPr>
+          <w:rFonts w:eastAsia="Courier New" w:cs="Courier New" w:ascii="Courier New" w:hAnsi="Courier New"/>
+          <w:color w:val="1A1A1A"/>
+          <w:sz w:val="18"/>
+          <w:szCs w:val="18"/>
+        </w:rPr>
+        <w:t xml:space="preserve">  /path/to/genome.fasta</w:t>
       </w:r>
     </w:p>
     <w:p>
@@ -4473,70 +4374,43 @@
           <w:sz w:val="18"/>
           <w:szCs w:val="18"/>
         </w:rPr>
-        <w:t xml:space="preserve">  </w:t>
-      </w:r>
-      <w:r>
-        <w:rPr>
-          <w:rFonts w:eastAsia="Courier New" w:cs="Courier New" w:ascii="Courier New" w:hAnsi="Courier New"/>
-          <w:color w:val="1A1A1A"/>
-          <w:sz w:val="18"/>
-          <w:szCs w:val="18"/>
-        </w:rPr>
-        <w:t>--db-path $MIGA_HOME/Phyla_Lite \</w:t>
-      </w:r>
-    </w:p>
-    <w:p>
-      <w:pPr>
-        <w:pStyle w:val="Normal"/>
-        <w:shd w:val="clear" w:fill="F2F2F2"/>
-        <w:spacing w:before="60" w:after="60"/>
-        <w:ind w:left="360"/>
-        <w:rPr/>
-      </w:pPr>
-      <w:r>
-        <w:rPr>
-          <w:rFonts w:eastAsia="Courier New" w:cs="Courier New" w:ascii="Courier New" w:hAnsi="Courier New"/>
-          <w:color w:val="1A1A1A"/>
-          <w:sz w:val="18"/>
-          <w:szCs w:val="18"/>
-        </w:rPr>
-        <w:t xml:space="preserve">  </w:t>
-      </w:r>
-      <w:r>
-        <w:rPr>
-          <w:rFonts w:eastAsia="Courier New" w:cs="Courier New" w:ascii="Courier New" w:hAnsi="Courier New"/>
-          <w:color w:val="1A1A1A"/>
-          <w:sz w:val="18"/>
-          <w:szCs w:val="18"/>
-        </w:rPr>
-        <w:t>-o /path/to/output_dir \</w:t>
-      </w:r>
-    </w:p>
-    <w:p>
-      <w:pPr>
-        <w:pStyle w:val="Normal"/>
-        <w:shd w:val="clear" w:fill="F2F2F2"/>
-        <w:spacing w:before="60" w:after="60"/>
-        <w:ind w:left="360"/>
-        <w:rPr/>
-      </w:pPr>
-      <w:r>
-        <w:rPr>
-          <w:rFonts w:eastAsia="Courier New" w:cs="Courier New" w:ascii="Courier New" w:hAnsi="Courier New"/>
-          <w:color w:val="1A1A1A"/>
-          <w:sz w:val="18"/>
-          <w:szCs w:val="18"/>
-        </w:rPr>
-        <w:t xml:space="preserve">  </w:t>
-      </w:r>
-      <w:r>
-        <w:rPr>
-          <w:rFonts w:eastAsia="Courier New" w:cs="Courier New" w:ascii="Courier New" w:hAnsi="Courier New"/>
-          <w:color w:val="1A1A1A"/>
-          <w:sz w:val="18"/>
-          <w:szCs w:val="18"/>
-        </w:rPr>
-        <w:t>/path/to/genome.fasta</w:t>
+        <w:t xml:space="preserve">  --db-path $MIGA_HOME/Phyla_Lite \</w:t>
+      </w:r>
+    </w:p>
+    <w:p>
+      <w:pPr>
+        <w:pStyle w:val="Normal"/>
+        <w:shd w:val="clear" w:fill="F2F2F2"/>
+        <w:spacing w:before="60" w:after="60"/>
+        <w:ind w:left="360"/>
+        <w:rPr/>
+      </w:pPr>
+      <w:r>
+        <w:rPr>
+          <w:rFonts w:eastAsia="Courier New" w:cs="Courier New" w:ascii="Courier New" w:hAnsi="Courier New"/>
+          <w:color w:val="1A1A1A"/>
+          <w:sz w:val="18"/>
+          <w:szCs w:val="18"/>
+        </w:rPr>
+        <w:t xml:space="preserve">  -o /path/to/output_dir \</w:t>
+      </w:r>
+    </w:p>
+    <w:p>
+      <w:pPr>
+        <w:pStyle w:val="Normal"/>
+        <w:shd w:val="clear" w:fill="F2F2F2"/>
+        <w:spacing w:before="60" w:after="60"/>
+        <w:ind w:left="360"/>
+        <w:rPr/>
+      </w:pPr>
+      <w:r>
+        <w:rPr>
+          <w:rFonts w:eastAsia="Courier New" w:cs="Courier New" w:ascii="Courier New" w:hAnsi="Courier New"/>
+          <w:color w:val="1A1A1A"/>
+          <w:sz w:val="18"/>
+          <w:szCs w:val="18"/>
+        </w:rPr>
+        <w:t xml:space="preserve">  /path/to/genome.fasta</w:t>
       </w:r>
     </w:p>
     <w:p>
@@ -4618,97 +4492,61 @@
           <w:sz w:val="18"/>
           <w:szCs w:val="18"/>
         </w:rPr>
-        <w:t xml:space="preserve">  </w:t>
-      </w:r>
-      <w:r>
-        <w:rPr>
-          <w:rFonts w:eastAsia="Courier New" w:cs="Courier New" w:ascii="Courier New" w:hAnsi="Courier New"/>
-          <w:color w:val="1A1A1A"/>
-          <w:sz w:val="18"/>
-          <w:szCs w:val="18"/>
-        </w:rPr>
-        <w:t>--db-path $MIGA_HOME/TypeMat_Lite \</w:t>
-      </w:r>
-    </w:p>
-    <w:p>
-      <w:pPr>
-        <w:pStyle w:val="Normal"/>
-        <w:shd w:val="clear" w:fill="F2F2F2"/>
-        <w:spacing w:before="60" w:after="60"/>
-        <w:ind w:left="360"/>
-        <w:rPr/>
-      </w:pPr>
-      <w:r>
-        <w:rPr>
-          <w:rFonts w:eastAsia="Courier New" w:cs="Courier New" w:ascii="Courier New" w:hAnsi="Courier New"/>
-          <w:color w:val="1A1A1A"/>
-          <w:sz w:val="18"/>
-          <w:szCs w:val="18"/>
-        </w:rPr>
-        <w:t xml:space="preserve">  </w:t>
-      </w:r>
-      <w:r>
-        <w:rPr>
-          <w:rFonts w:eastAsia="Courier New" w:cs="Courier New" w:ascii="Courier New" w:hAnsi="Courier New"/>
-          <w:color w:val="1A1A1A"/>
-          <w:sz w:val="18"/>
-          <w:szCs w:val="18"/>
-        </w:rPr>
-        <w:t>-o /media/bharat/volume1/miga_classify_results \</w:t>
-      </w:r>
-    </w:p>
-    <w:p>
-      <w:pPr>
-        <w:pStyle w:val="Normal"/>
-        <w:shd w:val="clear" w:fill="F2F2F2"/>
-        <w:spacing w:before="60" w:after="60"/>
-        <w:ind w:left="360"/>
-        <w:rPr/>
-      </w:pPr>
-      <w:r>
-        <w:rPr>
-          <w:rFonts w:eastAsia="Courier New" w:cs="Courier New" w:ascii="Courier New" w:hAnsi="Courier New"/>
-          <w:color w:val="1A1A1A"/>
-          <w:sz w:val="18"/>
-          <w:szCs w:val="18"/>
-        </w:rPr>
-        <w:t xml:space="preserve">  </w:t>
-      </w:r>
-      <w:r>
-        <w:rPr>
-          <w:rFonts w:eastAsia="Courier New" w:cs="Courier New" w:ascii="Courier New" w:hAnsi="Courier New"/>
-          <w:color w:val="1A1A1A"/>
-          <w:sz w:val="18"/>
-          <w:szCs w:val="18"/>
-        </w:rPr>
-        <w:t>/path/to/bins/*.fasta \</w:t>
-      </w:r>
-    </w:p>
-    <w:p>
-      <w:pPr>
-        <w:pStyle w:val="Normal"/>
-        <w:shd w:val="clear" w:fill="F2F2F2"/>
-        <w:spacing w:before="60" w:after="60"/>
-        <w:ind w:left="360"/>
-        <w:rPr/>
-      </w:pPr>
-      <w:r>
-        <w:rPr>
-          <w:rFonts w:eastAsia="Courier New" w:cs="Courier New" w:ascii="Courier New" w:hAnsi="Courier New"/>
-          <w:color w:val="1A1A1A"/>
-          <w:sz w:val="18"/>
-          <w:szCs w:val="18"/>
-        </w:rPr>
-        <w:t xml:space="preserve">  </w:t>
-      </w:r>
-      <w:r>
-        <w:rPr>
-          <w:rFonts w:eastAsia="Courier New" w:cs="Courier New" w:ascii="Courier New" w:hAnsi="Courier New"/>
-          <w:color w:val="1A1A1A"/>
-          <w:sz w:val="18"/>
-          <w:szCs w:val="18"/>
-        </w:rPr>
-        <w:t>2&gt;&amp;1 | tee miga_classify.log</w:t>
+        <w:t xml:space="preserve">  --db-path $MIGA_HOME/TypeMat_Lite \</w:t>
+      </w:r>
+    </w:p>
+    <w:p>
+      <w:pPr>
+        <w:pStyle w:val="Normal"/>
+        <w:shd w:val="clear" w:fill="F2F2F2"/>
+        <w:spacing w:before="60" w:after="60"/>
+        <w:ind w:left="360"/>
+        <w:rPr/>
+      </w:pPr>
+      <w:r>
+        <w:rPr>
+          <w:rFonts w:eastAsia="Courier New" w:cs="Courier New" w:ascii="Courier New" w:hAnsi="Courier New"/>
+          <w:color w:val="1A1A1A"/>
+          <w:sz w:val="18"/>
+          <w:szCs w:val="18"/>
+        </w:rPr>
+        <w:t xml:space="preserve">  -o /media/bharat/volume1/miga_classify_results \</w:t>
+      </w:r>
+    </w:p>
+    <w:p>
+      <w:pPr>
+        <w:pStyle w:val="Normal"/>
+        <w:shd w:val="clear" w:fill="F2F2F2"/>
+        <w:spacing w:before="60" w:after="60"/>
+        <w:ind w:left="360"/>
+        <w:rPr/>
+      </w:pPr>
+      <w:r>
+        <w:rPr>
+          <w:rFonts w:eastAsia="Courier New" w:cs="Courier New" w:ascii="Courier New" w:hAnsi="Courier New"/>
+          <w:color w:val="1A1A1A"/>
+          <w:sz w:val="18"/>
+          <w:szCs w:val="18"/>
+        </w:rPr>
+        <w:t xml:space="preserve">  /path/to/bins/*.fasta \</w:t>
+      </w:r>
+    </w:p>
+    <w:p>
+      <w:pPr>
+        <w:pStyle w:val="Normal"/>
+        <w:shd w:val="clear" w:fill="F2F2F2"/>
+        <w:spacing w:before="60" w:after="60"/>
+        <w:ind w:left="360"/>
+        <w:rPr/>
+      </w:pPr>
+      <w:r>
+        <w:rPr>
+          <w:rFonts w:eastAsia="Courier New" w:cs="Courier New" w:ascii="Courier New" w:hAnsi="Courier New"/>
+          <w:color w:val="1A1A1A"/>
+          <w:sz w:val="18"/>
+          <w:szCs w:val="18"/>
+        </w:rPr>
+        <w:t xml:space="preserve">  2&gt;&amp;1 | tee miga_classify.log</w:t>
       </w:r>
     </w:p>
     <w:p>
@@ -4822,16 +4660,7 @@
           <w:sz w:val="20"/>
           <w:szCs w:val="20"/>
         </w:rPr>
-        <w:t xml:space="preserve">✓ </w:t>
-      </w:r>
-      <w:r>
-        <w:rPr>
-          <w:rFonts w:eastAsia="Arial" w:cs="Arial"/>
-          <w:color w:val="375623"/>
-          <w:sz w:val="20"/>
-          <w:szCs w:val="20"/>
-        </w:rPr>
-        <w:t>Tip: For POND MAG analysis: run classify_wf against TypeMat_Lite on all 32 bins. Cross-reference with CompareM2 GTDB-Tk results by bin name for confirmation.</w:t>
+        <w:t>✓ Tip: For POND MAG analysis: run classify_wf against TypeMat_Lite on all 32 bins. Cross-reference with CompareM2 GTDB-Tk results by bin name for confirmation.</w:t>
       </w:r>
     </w:p>
     <w:p>
@@ -4894,43 +4723,25 @@
           <w:sz w:val="18"/>
           <w:szCs w:val="18"/>
         </w:rPr>
-        <w:t xml:space="preserve">  </w:t>
-      </w:r>
-      <w:r>
-        <w:rPr>
-          <w:rFonts w:eastAsia="Courier New" w:cs="Courier New" w:ascii="Courier New" w:hAnsi="Courier New"/>
-          <w:color w:val="1A1A1A"/>
-          <w:sz w:val="18"/>
-          <w:szCs w:val="18"/>
-        </w:rPr>
-        <w:t>-o /path/to/output_dir \</w:t>
-      </w:r>
-    </w:p>
-    <w:p>
-      <w:pPr>
-        <w:pStyle w:val="Normal"/>
-        <w:shd w:val="clear" w:fill="F2F2F2"/>
-        <w:spacing w:before="60" w:after="60"/>
-        <w:ind w:left="360"/>
-        <w:rPr/>
-      </w:pPr>
-      <w:r>
-        <w:rPr>
-          <w:rFonts w:eastAsia="Courier New" w:cs="Courier New" w:ascii="Courier New" w:hAnsi="Courier New"/>
-          <w:color w:val="1A1A1A"/>
-          <w:sz w:val="18"/>
-          <w:szCs w:val="18"/>
-        </w:rPr>
-        <w:t xml:space="preserve">  </w:t>
-      </w:r>
-      <w:r>
-        <w:rPr>
-          <w:rFonts w:eastAsia="Courier New" w:cs="Courier New" w:ascii="Courier New" w:hAnsi="Courier New"/>
-          <w:color w:val="1A1A1A"/>
-          <w:sz w:val="18"/>
-          <w:szCs w:val="18"/>
-        </w:rPr>
-        <w:t>/path/to/genomes/*.fasta</w:t>
+        <w:t xml:space="preserve">  -o /path/to/output_dir \</w:t>
+      </w:r>
+    </w:p>
+    <w:p>
+      <w:pPr>
+        <w:pStyle w:val="Normal"/>
+        <w:shd w:val="clear" w:fill="F2F2F2"/>
+        <w:spacing w:before="60" w:after="60"/>
+        <w:ind w:left="360"/>
+        <w:rPr/>
+      </w:pPr>
+      <w:r>
+        <w:rPr>
+          <w:rFonts w:eastAsia="Courier New" w:cs="Courier New" w:ascii="Courier New" w:hAnsi="Courier New"/>
+          <w:color w:val="1A1A1A"/>
+          <w:sz w:val="18"/>
+          <w:szCs w:val="18"/>
+        </w:rPr>
+        <w:t xml:space="preserve">  /path/to/genomes/*.fasta</w:t>
       </w:r>
     </w:p>
     <w:p>
@@ -4994,70 +4805,43 @@
           <w:sz w:val="18"/>
           <w:szCs w:val="18"/>
         </w:rPr>
-        <w:t xml:space="preserve">  </w:t>
-      </w:r>
-      <w:r>
-        <w:rPr>
-          <w:rFonts w:eastAsia="Courier New" w:cs="Courier New" w:ascii="Courier New" w:hAnsi="Courier New"/>
-          <w:color w:val="1A1A1A"/>
-          <w:sz w:val="18"/>
-          <w:szCs w:val="18"/>
-        </w:rPr>
-        <w:t>-o /path/to/output_dir \</w:t>
-      </w:r>
-    </w:p>
-    <w:p>
-      <w:pPr>
-        <w:pStyle w:val="Normal"/>
-        <w:shd w:val="clear" w:fill="F2F2F2"/>
-        <w:spacing w:before="60" w:after="60"/>
-        <w:ind w:left="360"/>
-        <w:rPr/>
-      </w:pPr>
-      <w:r>
-        <w:rPr>
-          <w:rFonts w:eastAsia="Courier New" w:cs="Courier New" w:ascii="Courier New" w:hAnsi="Courier New"/>
-          <w:color w:val="1A1A1A"/>
-          <w:sz w:val="18"/>
-          <w:szCs w:val="18"/>
-        </w:rPr>
-        <w:t xml:space="preserve">  </w:t>
-      </w:r>
-      <w:r>
-        <w:rPr>
-          <w:rFonts w:eastAsia="Courier New" w:cs="Courier New" w:ascii="Courier New" w:hAnsi="Courier New"/>
-          <w:color w:val="1A1A1A"/>
-          <w:sz w:val="18"/>
-          <w:szCs w:val="18"/>
-        </w:rPr>
-        <w:t>--fast --haai-p fastaai \</w:t>
-      </w:r>
-    </w:p>
-    <w:p>
-      <w:pPr>
-        <w:pStyle w:val="Normal"/>
-        <w:shd w:val="clear" w:fill="F2F2F2"/>
-        <w:spacing w:before="60" w:after="60"/>
-        <w:ind w:left="360"/>
-        <w:rPr/>
-      </w:pPr>
-      <w:r>
-        <w:rPr>
-          <w:rFonts w:eastAsia="Courier New" w:cs="Courier New" w:ascii="Courier New" w:hAnsi="Courier New"/>
-          <w:color w:val="1A1A1A"/>
-          <w:sz w:val="18"/>
-          <w:szCs w:val="18"/>
-        </w:rPr>
-        <w:t xml:space="preserve">  </w:t>
-      </w:r>
-      <w:r>
-        <w:rPr>
-          <w:rFonts w:eastAsia="Courier New" w:cs="Courier New" w:ascii="Courier New" w:hAnsi="Courier New"/>
-          <w:color w:val="1A1A1A"/>
-          <w:sz w:val="18"/>
-          <w:szCs w:val="18"/>
-        </w:rPr>
-        <w:t>/path/to/genomes/*.fasta</w:t>
+        <w:t xml:space="preserve">  -o /path/to/output_dir \</w:t>
+      </w:r>
+    </w:p>
+    <w:p>
+      <w:pPr>
+        <w:pStyle w:val="Normal"/>
+        <w:shd w:val="clear" w:fill="F2F2F2"/>
+        <w:spacing w:before="60" w:after="60"/>
+        <w:ind w:left="360"/>
+        <w:rPr/>
+      </w:pPr>
+      <w:r>
+        <w:rPr>
+          <w:rFonts w:eastAsia="Courier New" w:cs="Courier New" w:ascii="Courier New" w:hAnsi="Courier New"/>
+          <w:color w:val="1A1A1A"/>
+          <w:sz w:val="18"/>
+          <w:szCs w:val="18"/>
+        </w:rPr>
+        <w:t xml:space="preserve">  --fast --haai-p fastaai \</w:t>
+      </w:r>
+    </w:p>
+    <w:p>
+      <w:pPr>
+        <w:pStyle w:val="Normal"/>
+        <w:shd w:val="clear" w:fill="F2F2F2"/>
+        <w:spacing w:before="60" w:after="60"/>
+        <w:ind w:left="360"/>
+        <w:rPr/>
+      </w:pPr>
+      <w:r>
+        <w:rPr>
+          <w:rFonts w:eastAsia="Courier New" w:cs="Courier New" w:ascii="Courier New" w:hAnsi="Courier New"/>
+          <w:color w:val="1A1A1A"/>
+          <w:sz w:val="18"/>
+          <w:szCs w:val="18"/>
+        </w:rPr>
+        <w:t xml:space="preserve">  /path/to/genomes/*.fasta</w:t>
       </w:r>
     </w:p>
     <w:p>
@@ -5171,16 +4955,7 @@
           <w:sz w:val="20"/>
           <w:szCs w:val="20"/>
         </w:rPr>
-        <w:t xml:space="preserve">⚠ </w:t>
-      </w:r>
-      <w:r>
-        <w:rPr>
-          <w:rFonts w:eastAsia="Arial" w:cs="Arial"/>
-          <w:color w:val="7F6000"/>
-          <w:sz w:val="20"/>
-          <w:szCs w:val="20"/>
-        </w:rPr>
-        <w:t>Note: Do not use pixi run miga-cli init — it overwrites .miga_rc. Use the miga-new-project task instead.</w:t>
+        <w:t>⚠ Critical: Always use pixi run miga-cli new to create projects — never create them manually. The new command automatically creates the complete required directory structure (01.raw_reads through 10.clades with all subdirectories). Manual creation will miss subdirectories and cause the daemon to fail at each pipeline step. Do not use pixi run miga-cli init — it overwrites .miga_rc and .miga_modules with defaults, breaking all Pixi path configurations. Use pixi run miga-setup-vault-config instead.</w:t>
       </w:r>
     </w:p>
     <w:p>
@@ -5423,43 +5198,25 @@
           <w:sz w:val="18"/>
           <w:szCs w:val="18"/>
         </w:rPr>
-        <w:t xml:space="preserve">  </w:t>
-      </w:r>
-      <w:r>
-        <w:rPr>
-          <w:rFonts w:eastAsia="Courier New" w:cs="Courier New" w:ascii="Courier New" w:hAnsi="Courier New"/>
-          <w:color w:val="1A1A1A"/>
-          <w:sz w:val="18"/>
-          <w:szCs w:val="18"/>
-        </w:rPr>
-        <w:t>-P &lt;project_name&gt; \</w:t>
-      </w:r>
-    </w:p>
-    <w:p>
-      <w:pPr>
-        <w:pStyle w:val="Normal"/>
-        <w:shd w:val="clear" w:fill="F2F2F2"/>
-        <w:spacing w:before="60" w:after="60"/>
-        <w:ind w:left="360"/>
-        <w:rPr/>
-      </w:pPr>
-      <w:r>
-        <w:rPr>
-          <w:rFonts w:eastAsia="Courier New" w:cs="Courier New" w:ascii="Courier New" w:hAnsi="Courier New"/>
-          <w:color w:val="1A1A1A"/>
-          <w:sz w:val="18"/>
-          <w:szCs w:val="18"/>
-        </w:rPr>
-        <w:t xml:space="preserve">  </w:t>
-      </w:r>
-      <w:r>
-        <w:rPr>
-          <w:rFonts w:eastAsia="Courier New" w:cs="Courier New" w:ascii="Courier New" w:hAnsi="Courier New"/>
-          <w:color w:val="1A1A1A"/>
-          <w:sz w:val="18"/>
-          <w:szCs w:val="18"/>
-        </w:rPr>
-        <w:t>-m ref_project="$MIGA_HOME/TypeMat_Lite"</w:t>
+        <w:t xml:space="preserve">  -P &lt;project_name&gt; \</w:t>
+      </w:r>
+    </w:p>
+    <w:p>
+      <w:pPr>
+        <w:pStyle w:val="Normal"/>
+        <w:shd w:val="clear" w:fill="F2F2F2"/>
+        <w:spacing w:before="60" w:after="60"/>
+        <w:ind w:left="360"/>
+        <w:rPr/>
+      </w:pPr>
+      <w:r>
+        <w:rPr>
+          <w:rFonts w:eastAsia="Courier New" w:cs="Courier New" w:ascii="Courier New" w:hAnsi="Courier New"/>
+          <w:color w:val="1A1A1A"/>
+          <w:sz w:val="18"/>
+          <w:szCs w:val="18"/>
+        </w:rPr>
+        <w:t xml:space="preserve">  -m ref_project="$MIGA_HOME/TypeMat_Lite"</w:t>
       </w:r>
     </w:p>
     <w:p>
@@ -5487,16 +5244,7 @@
           <w:sz w:val="20"/>
           <w:szCs w:val="20"/>
         </w:rPr>
-        <w:t xml:space="preserve">⚠ </w:t>
-      </w:r>
-      <w:r>
-        <w:rPr>
-          <w:rFonts w:eastAsia="Arial" w:cs="Arial"/>
-          <w:color w:val="7F6000"/>
-          <w:sz w:val="20"/>
-          <w:szCs w:val="20"/>
-        </w:rPr>
-        <w:t>Note: Without this step, the daemon will run quality steps but skip taxonomy, distances, and tree generation entirely.</w:t>
+        <w:t>⚠ Note: Without this step, the daemon will run quality steps but skip taxonomy, distances, and tree generation entirely.</w:t>
       </w:r>
     </w:p>
     <w:p>
@@ -5529,19 +5277,68 @@
     <w:p>
       <w:pPr>
         <w:pStyle w:val="Normal"/>
-        <w:shd w:val="clear" w:fill="F2F2F2"/>
-        <w:spacing w:before="60" w:after="60"/>
-        <w:ind w:left="360"/>
-        <w:rPr/>
-      </w:pPr>
-      <w:r>
-        <w:rPr>
-          <w:rFonts w:eastAsia="Courier New" w:cs="Courier New" w:ascii="Courier New" w:hAnsi="Courier New"/>
-          <w:color w:val="1A1A1A"/>
-          <w:sz w:val="18"/>
-          <w:szCs w:val="18"/>
-        </w:rPr>
-        <w:t># Add a single genome assembly</w:t>
+        <w:spacing w:before="120" w:after="80"/>
+        <w:rPr/>
+      </w:pPr>
+      <w:r>
+        <w:rPr>
+          <w:rFonts w:eastAsia="Arial" w:cs="Arial"/>
+          <w:color w:val="404040"/>
+          <w:sz w:val="22"/>
+          <w:szCs w:val="22"/>
+        </w:rPr>
+        <w:t>MiGA accepts two input types. Choose one based on your data — do not mix input types in the same project.</w:t>
+      </w:r>
+    </w:p>
+    <w:p>
+      <w:pPr>
+        <w:pStyle w:val="Normal"/>
+        <w:spacing w:before="120" w:after="60"/>
+        <w:rPr/>
+      </w:pPr>
+      <w:r>
+        <w:rPr>
+          <w:rFonts w:eastAsia="Arial" w:cs="Arial" w:ascii="Arial" w:hAnsi="Arial"/>
+          <w:b/>
+          <w:color w:val="1F5C99"/>
+          <w:sz w:val="22"/>
+          <w:szCs w:val="22"/>
+        </w:rPr>
+        <w:t>Type A: Pre-assembled genomes (MAGs, isolate genomes) — RECOMMENDED for MetaWRAP output</w:t>
+      </w:r>
+    </w:p>
+    <w:p>
+      <w:pPr>
+        <w:pStyle w:val="Normal"/>
+        <w:spacing w:before="60" w:after="60"/>
+        <w:rPr/>
+      </w:pPr>
+      <w:r>
+        <w:rPr>
+          <w:rFonts w:eastAsia="Arial" w:cs="Arial"/>
+          <w:color w:val="404040"/>
+          <w:sz w:val="22"/>
+          <w:szCs w:val="22"/>
+        </w:rPr>
+        <w:t>Assembly files (.fa / .fasta) are placed in 05.assembly. Use -i assembly. Pipeline starts at step 06.cds — trimming and assembly steps are skipped.</w:t>
+      </w:r>
+    </w:p>
+    <w:p>
+      <w:pPr>
+        <w:pStyle w:val="Normal"/>
+        <w:shd w:val="clear" w:fill="F2F2F2"/>
+        <w:spacing w:before="60" w:after="60"/>
+        <w:ind w:left="360"/>
+        <w:rPr/>
+      </w:pPr>
+      <w:r>
+        <w:rPr>
+          <w:rFonts w:eastAsia="Courier New" w:cs="Courier New" w:ascii="Courier New" w:hAnsi="Courier New"/>
+          <w:color w:val="1A1A1A"/>
+          <w:sz w:val="18"/>
+          <w:szCs w:val="18"/>
+        </w:rPr>
+        <w:t># Add a single pre-assembled genome (MAG / isolate)</w:t>
       </w:r>
     </w:p>
     <w:p>
@@ -5577,124 +5374,97 @@
           <w:sz w:val="18"/>
           <w:szCs w:val="18"/>
         </w:rPr>
-        <w:t xml:space="preserve">  </w:t>
-      </w:r>
-      <w:r>
-        <w:rPr>
-          <w:rFonts w:eastAsia="Courier New" w:cs="Courier New" w:ascii="Courier New" w:hAnsi="Courier New"/>
-          <w:color w:val="1A1A1A"/>
-          <w:sz w:val="18"/>
-          <w:szCs w:val="18"/>
-        </w:rPr>
-        <w:t>-P &lt;project_name&gt; \</w:t>
-      </w:r>
-    </w:p>
-    <w:p>
-      <w:pPr>
-        <w:pStyle w:val="Normal"/>
-        <w:shd w:val="clear" w:fill="F2F2F2"/>
-        <w:spacing w:before="60" w:after="60"/>
-        <w:ind w:left="360"/>
-        <w:rPr/>
-      </w:pPr>
-      <w:r>
-        <w:rPr>
-          <w:rFonts w:eastAsia="Courier New" w:cs="Courier New" w:ascii="Courier New" w:hAnsi="Courier New"/>
-          <w:color w:val="1A1A1A"/>
-          <w:sz w:val="18"/>
-          <w:szCs w:val="18"/>
-        </w:rPr>
-        <w:t xml:space="preserve">  </w:t>
-      </w:r>
-      <w:r>
-        <w:rPr>
-          <w:rFonts w:eastAsia="Courier New" w:cs="Courier New" w:ascii="Courier New" w:hAnsi="Courier New"/>
-          <w:color w:val="1A1A1A"/>
-          <w:sz w:val="18"/>
-          <w:szCs w:val="18"/>
-        </w:rPr>
-        <w:t>-D &lt;bin_name&gt; \</w:t>
-      </w:r>
-    </w:p>
-    <w:p>
-      <w:pPr>
-        <w:pStyle w:val="Normal"/>
-        <w:shd w:val="clear" w:fill="F2F2F2"/>
-        <w:spacing w:before="60" w:after="60"/>
-        <w:ind w:left="360"/>
-        <w:rPr/>
-      </w:pPr>
-      <w:r>
-        <w:rPr>
-          <w:rFonts w:eastAsia="Courier New" w:cs="Courier New" w:ascii="Courier New" w:hAnsi="Courier New"/>
-          <w:color w:val="1A1A1A"/>
-          <w:sz w:val="18"/>
-          <w:szCs w:val="18"/>
-        </w:rPr>
-        <w:t xml:space="preserve">  </w:t>
-      </w:r>
-      <w:r>
-        <w:rPr>
-          <w:rFonts w:eastAsia="Courier New" w:cs="Courier New" w:ascii="Courier New" w:hAnsi="Courier New"/>
-          <w:color w:val="1A1A1A"/>
-          <w:sz w:val="18"/>
-          <w:szCs w:val="18"/>
-        </w:rPr>
-        <w:t>-t genome \</w:t>
-      </w:r>
-    </w:p>
-    <w:p>
-      <w:pPr>
-        <w:pStyle w:val="Normal"/>
-        <w:shd w:val="clear" w:fill="F2F2F2"/>
-        <w:spacing w:before="60" w:after="60"/>
-        <w:ind w:left="360"/>
-        <w:rPr/>
-      </w:pPr>
-      <w:r>
-        <w:rPr>
-          <w:rFonts w:eastAsia="Courier New" w:cs="Courier New" w:ascii="Courier New" w:hAnsi="Courier New"/>
-          <w:color w:val="1A1A1A"/>
-          <w:sz w:val="18"/>
-          <w:szCs w:val="18"/>
-        </w:rPr>
-        <w:t xml:space="preserve">  </w:t>
-      </w:r>
-      <w:r>
-        <w:rPr>
-          <w:rFonts w:eastAsia="Courier New" w:cs="Courier New" w:ascii="Courier New" w:hAnsi="Courier New"/>
-          <w:color w:val="1A1A1A"/>
-          <w:sz w:val="18"/>
-          <w:szCs w:val="18"/>
-        </w:rPr>
-        <w:t>-i assembly \</w:t>
-      </w:r>
-    </w:p>
-    <w:p>
-      <w:pPr>
-        <w:pStyle w:val="Normal"/>
-        <w:shd w:val="clear" w:fill="F2F2F2"/>
-        <w:spacing w:before="60" w:after="60"/>
-        <w:ind w:left="360"/>
-        <w:rPr/>
-      </w:pPr>
-      <w:r>
-        <w:rPr>
-          <w:rFonts w:eastAsia="Courier New" w:cs="Courier New" w:ascii="Courier New" w:hAnsi="Courier New"/>
-          <w:color w:val="1A1A1A"/>
-          <w:sz w:val="18"/>
-          <w:szCs w:val="18"/>
-        </w:rPr>
-        <w:t xml:space="preserve">  </w:t>
-      </w:r>
-      <w:r>
-        <w:rPr>
-          <w:rFonts w:eastAsia="Courier New" w:cs="Courier New" w:ascii="Courier New" w:hAnsi="Courier New"/>
-          <w:color w:val="1A1A1A"/>
-          <w:sz w:val="18"/>
-          <w:szCs w:val="18"/>
-        </w:rPr>
-        <w:t>/path/to/genome.fasta</w:t>
+        <w:t xml:space="preserve">  -P &lt;project_name&gt; \</w:t>
+      </w:r>
+    </w:p>
+    <w:p>
+      <w:pPr>
+        <w:pStyle w:val="Normal"/>
+        <w:shd w:val="clear" w:fill="F2F2F2"/>
+        <w:spacing w:before="60" w:after="60"/>
+        <w:ind w:left="360"/>
+        <w:rPr/>
+      </w:pPr>
+      <w:r>
+        <w:rPr>
+          <w:rFonts w:eastAsia="Courier New" w:cs="Courier New" w:ascii="Courier New" w:hAnsi="Courier New"/>
+          <w:color w:val="1A1A1A"/>
+          <w:sz w:val="18"/>
+          <w:szCs w:val="18"/>
+        </w:rPr>
+        <w:t xml:space="preserve">  -D &lt;genome_name&gt; \</w:t>
+      </w:r>
+    </w:p>
+    <w:p>
+      <w:pPr>
+        <w:pStyle w:val="Normal"/>
+        <w:shd w:val="clear" w:fill="F2F2F2"/>
+        <w:spacing w:before="60" w:after="60"/>
+        <w:ind w:left="360"/>
+        <w:rPr/>
+      </w:pPr>
+      <w:r>
+        <w:rPr>
+          <w:rFonts w:eastAsia="Courier New" w:cs="Courier New" w:ascii="Courier New" w:hAnsi="Courier New"/>
+          <w:color w:val="1A1A1A"/>
+          <w:sz w:val="18"/>
+          <w:szCs w:val="18"/>
+        </w:rPr>
+        <w:t xml:space="preserve">  -t genome \</w:t>
+      </w:r>
+    </w:p>
+    <w:p>
+      <w:pPr>
+        <w:pStyle w:val="Normal"/>
+        <w:shd w:val="clear" w:fill="F2F2F2"/>
+        <w:spacing w:before="60" w:after="60"/>
+        <w:ind w:left="360"/>
+        <w:rPr/>
+      </w:pPr>
+      <w:r>
+        <w:rPr>
+          <w:rFonts w:eastAsia="Courier New" w:cs="Courier New" w:ascii="Courier New" w:hAnsi="Courier New"/>
+          <w:color w:val="1A1A1A"/>
+          <w:sz w:val="18"/>
+          <w:szCs w:val="18"/>
+        </w:rPr>
+        <w:t xml:space="preserve">  -i assembly \</w:t>
+      </w:r>
+    </w:p>
+    <w:p>
+      <w:pPr>
+        <w:pStyle w:val="Normal"/>
+        <w:shd w:val="clear" w:fill="F2F2F2"/>
+        <w:spacing w:before="60" w:after="60"/>
+        <w:ind w:left="360"/>
+        <w:rPr/>
+      </w:pPr>
+      <w:r>
+        <w:rPr>
+          <w:rFonts w:eastAsia="Courier New" w:cs="Courier New" w:ascii="Courier New" w:hAnsi="Courier New"/>
+          <w:color w:val="1A1A1A"/>
+          <w:sz w:val="18"/>
+          <w:szCs w:val="18"/>
+        </w:rPr>
+        <w:t xml:space="preserve">  -m run_mytaxa_scan=false \</w:t>
+      </w:r>
+    </w:p>
+    <w:p>
+      <w:pPr>
+        <w:pStyle w:val="Normal"/>
+        <w:shd w:val="clear" w:fill="F2F2F2"/>
+        <w:spacing w:before="60" w:after="60"/>
+        <w:ind w:left="360"/>
+        <w:rPr/>
+      </w:pPr>
+      <w:r>
+        <w:rPr>
+          <w:rFonts w:eastAsia="Courier New" w:cs="Courier New" w:ascii="Courier New" w:hAnsi="Courier New"/>
+          <w:color w:val="1A1A1A"/>
+          <w:sz w:val="18"/>
+          <w:szCs w:val="18"/>
+        </w:rPr>
+        <w:t xml:space="preserve">  /path/to/genome.fa</w:t>
       </w:r>
     </w:p>
     <w:p>
@@ -5722,79 +5492,61 @@
           <w:sz w:val="18"/>
           <w:szCs w:val="18"/>
         </w:rPr>
-        <w:t># Add multiple genomes in batch</w:t>
-      </w:r>
-    </w:p>
-    <w:p>
-      <w:pPr>
-        <w:pStyle w:val="Normal"/>
-        <w:shd w:val="clear" w:fill="F2F2F2"/>
-        <w:spacing w:before="60" w:after="60"/>
-        <w:ind w:left="360"/>
-        <w:rPr/>
-      </w:pPr>
-      <w:r>
-        <w:rPr>
-          <w:rFonts w:eastAsia="Courier New" w:cs="Courier New" w:ascii="Courier New" w:hAnsi="Courier New"/>
-          <w:color w:val="1A1A1A"/>
-          <w:sz w:val="18"/>
-          <w:szCs w:val="18"/>
-        </w:rPr>
-        <w:t>for genome in /path/to/bins/*.fasta; do</w:t>
-      </w:r>
-    </w:p>
-    <w:p>
-      <w:pPr>
-        <w:pStyle w:val="Normal"/>
-        <w:shd w:val="clear" w:fill="F2F2F2"/>
-        <w:spacing w:before="60" w:after="60"/>
-        <w:ind w:left="360"/>
-        <w:rPr/>
-      </w:pPr>
-      <w:r>
-        <w:rPr>
-          <w:rFonts w:eastAsia="Courier New" w:cs="Courier New" w:ascii="Courier New" w:hAnsi="Courier New"/>
-          <w:color w:val="1A1A1A"/>
-          <w:sz w:val="18"/>
-          <w:szCs w:val="18"/>
-        </w:rPr>
-        <w:t xml:space="preserve">  </w:t>
-      </w:r>
-      <w:r>
-        <w:rPr>
-          <w:rFonts w:eastAsia="Courier New" w:cs="Courier New" w:ascii="Courier New" w:hAnsi="Courier New"/>
-          <w:color w:val="1A1A1A"/>
-          <w:sz w:val="18"/>
-          <w:szCs w:val="18"/>
-        </w:rPr>
-        <w:t>name=$(basename "$genome" .fasta)</w:t>
-      </w:r>
-    </w:p>
-    <w:p>
-      <w:pPr>
-        <w:pStyle w:val="Normal"/>
-        <w:shd w:val="clear" w:fill="F2F2F2"/>
-        <w:spacing w:before="60" w:after="60"/>
-        <w:ind w:left="360"/>
-        <w:rPr/>
-      </w:pPr>
-      <w:r>
-        <w:rPr>
-          <w:rFonts w:eastAsia="Courier New" w:cs="Courier New" w:ascii="Courier New" w:hAnsi="Courier New"/>
-          <w:color w:val="1A1A1A"/>
-          <w:sz w:val="18"/>
-          <w:szCs w:val="18"/>
-        </w:rPr>
-        <w:t xml:space="preserve">  </w:t>
-      </w:r>
-      <w:r>
-        <w:rPr>
-          <w:rFonts w:eastAsia="Courier New" w:cs="Courier New" w:ascii="Courier New" w:hAnsi="Courier New"/>
-          <w:color w:val="1A1A1A"/>
-          <w:sz w:val="18"/>
-          <w:szCs w:val="18"/>
-        </w:rPr>
-        <w:t>pixi run miga-cli add -P &lt;project&gt; -D "$name" -t genome -i assembly "$genome"</w:t>
+        <w:t># Batch add — multiple MAGs from MetaWRAP (recommended approach for GAB analysis)</w:t>
+      </w:r>
+    </w:p>
+    <w:p>
+      <w:pPr>
+        <w:pStyle w:val="Normal"/>
+        <w:shd w:val="clear" w:fill="F2F2F2"/>
+        <w:spacing w:before="60" w:after="60"/>
+        <w:ind w:left="360"/>
+        <w:rPr/>
+      </w:pPr>
+      <w:r>
+        <w:rPr>
+          <w:rFonts w:eastAsia="Courier New" w:cs="Courier New" w:ascii="Courier New" w:hAnsi="Courier New"/>
+          <w:color w:val="1A1A1A"/>
+          <w:sz w:val="18"/>
+          <w:szCs w:val="18"/>
+        </w:rPr>
+        <w:t>for fa in /path/to/metawrap_70_10_bins/*.fa; do</w:t>
+      </w:r>
+    </w:p>
+    <w:p>
+      <w:pPr>
+        <w:pStyle w:val="Normal"/>
+        <w:shd w:val="clear" w:fill="F2F2F2"/>
+        <w:spacing w:before="60" w:after="60"/>
+        <w:ind w:left="360"/>
+        <w:rPr/>
+      </w:pPr>
+      <w:r>
+        <w:rPr>
+          <w:rFonts w:eastAsia="Courier New" w:cs="Courier New" w:ascii="Courier New" w:hAnsi="Courier New"/>
+          <w:color w:val="1A1A1A"/>
+          <w:sz w:val="18"/>
+          <w:szCs w:val="18"/>
+        </w:rPr>
+        <w:t xml:space="preserve">    name=$(basename "$fa" .fa)</w:t>
+      </w:r>
+    </w:p>
+    <w:p>
+      <w:pPr>
+        <w:pStyle w:val="Normal"/>
+        <w:shd w:val="clear" w:fill="F2F2F2"/>
+        <w:spacing w:before="60" w:after="60"/>
+        <w:ind w:left="360"/>
+        <w:rPr/>
+      </w:pPr>
+      <w:r>
+        <w:rPr>
+          <w:rFonts w:eastAsia="Courier New" w:cs="Courier New" w:ascii="Courier New" w:hAnsi="Courier New"/>
+          <w:color w:val="1A1A1A"/>
+          <w:sz w:val="18"/>
+          <w:szCs w:val="18"/>
+        </w:rPr>
+        <w:t xml:space="preserve">    pixi run miga-cli add -P &lt;project&gt; -D "$name" -t genome -i assembly -m run_mytaxa_scan=false "$fa"</w:t>
       </w:r>
     </w:p>
     <w:p>
@@ -5828,6 +5580,274 @@
     <w:p>
       <w:pPr>
         <w:pStyle w:val="Normal"/>
+        <w:shd w:val="clear" w:fill="FFF2CC"/>
+        <w:spacing w:before="120" w:after="120"/>
+        <w:ind w:left="360" w:right="360"/>
+        <w:rPr/>
+      </w:pPr>
+      <w:r>
+        <w:rPr>
+          <w:rFonts w:eastAsia="Arial" w:cs="Arial"/>
+          <w:color w:val="7F6000"/>
+          <w:sz w:val="20"/>
+          <w:szCs w:val="20"/>
+        </w:rPr>
+        <w:t>⚠ Important: Use -D to set the dataset name explicitly (not -n). MiGA v1.4.1.6 requires -D for named datasets. Use -m run_mytaxa_scan=false to skip MyTaxa scan (disabled by default in .miga_rc but safer to set explicitly). Genome names must use only letters, numbers, and underscores.</w:t>
+      </w:r>
+    </w:p>
+    <w:p>
+      <w:pPr>
+        <w:pStyle w:val="Normal"/>
+        <w:spacing w:before="120" w:after="60"/>
+        <w:rPr/>
+      </w:pPr>
+      <w:r>
+        <w:rPr>
+          <w:rFonts w:eastAsia="Arial" w:cs="Arial" w:ascii="Arial" w:hAnsi="Arial"/>
+          <w:b/>
+          <w:color w:val="1F5C99"/>
+          <w:sz w:val="22"/>
+          <w:szCs w:val="22"/>
+        </w:rPr>
+        <w:t>Type B: Raw paired-end reads (Illumina)</w:t>
+      </w:r>
+    </w:p>
+    <w:p>
+      <w:pPr>
+        <w:pStyle w:val="Normal"/>
+        <w:spacing w:before="60" w:after="60"/>
+        <w:rPr/>
+      </w:pPr>
+      <w:r>
+        <w:rPr>
+          <w:rFonts w:eastAsia="Arial" w:cs="Arial"/>
+          <w:color w:val="404040"/>
+          <w:sz w:val="22"/>
+          <w:szCs w:val="22"/>
+        </w:rPr>
+        <w:t>Read files are placed in 01.raw_reads. Use -i raw_reads_paired. Full pipeline runs from trimming through assembly, gene calling, and taxonomy. Takes significantly longer than assembly input.</w:t>
+      </w:r>
+    </w:p>
+    <w:p>
+      <w:pPr>
+        <w:pStyle w:val="Normal"/>
+        <w:shd w:val="clear" w:fill="F2F2F2"/>
+        <w:spacing w:before="60" w:after="60"/>
+        <w:ind w:left="360"/>
+        <w:rPr/>
+      </w:pPr>
+      <w:r>
+        <w:rPr>
+          <w:rFonts w:eastAsia="Courier New" w:cs="Courier New" w:ascii="Courier New" w:hAnsi="Courier New"/>
+          <w:color w:val="1A1A1A"/>
+          <w:sz w:val="18"/>
+          <w:szCs w:val="18"/>
+        </w:rPr>
+        <w:t># Add a genome from paired-end raw reads</w:t>
+      </w:r>
+    </w:p>
+    <w:p>
+      <w:pPr>
+        <w:pStyle w:val="Normal"/>
+        <w:shd w:val="clear" w:fill="F2F2F2"/>
+        <w:spacing w:before="60" w:after="60"/>
+        <w:ind w:left="360"/>
+        <w:rPr/>
+      </w:pPr>
+      <w:r>
+        <w:rPr>
+          <w:rFonts w:eastAsia="Courier New" w:cs="Courier New" w:ascii="Courier New" w:hAnsi="Courier New"/>
+          <w:color w:val="1A1A1A"/>
+          <w:sz w:val="18"/>
+          <w:szCs w:val="18"/>
+        </w:rPr>
+        <w:t>pixi run miga-cli add \</w:t>
+      </w:r>
+    </w:p>
+    <w:p>
+      <w:pPr>
+        <w:pStyle w:val="Normal"/>
+        <w:shd w:val="clear" w:fill="F2F2F2"/>
+        <w:spacing w:before="60" w:after="60"/>
+        <w:ind w:left="360"/>
+        <w:rPr/>
+      </w:pPr>
+      <w:r>
+        <w:rPr>
+          <w:rFonts w:eastAsia="Courier New" w:cs="Courier New" w:ascii="Courier New" w:hAnsi="Courier New"/>
+          <w:color w:val="1A1A1A"/>
+          <w:sz w:val="18"/>
+          <w:szCs w:val="18"/>
+        </w:rPr>
+        <w:t xml:space="preserve">  -P &lt;project_name&gt; \</w:t>
+      </w:r>
+    </w:p>
+    <w:p>
+      <w:pPr>
+        <w:pStyle w:val="Normal"/>
+        <w:shd w:val="clear" w:fill="F2F2F2"/>
+        <w:spacing w:before="60" w:after="60"/>
+        <w:ind w:left="360"/>
+        <w:rPr/>
+      </w:pPr>
+      <w:r>
+        <w:rPr>
+          <w:rFonts w:eastAsia="Courier New" w:cs="Courier New" w:ascii="Courier New" w:hAnsi="Courier New"/>
+          <w:color w:val="1A1A1A"/>
+          <w:sz w:val="18"/>
+          <w:szCs w:val="18"/>
+        </w:rPr>
+        <w:t xml:space="preserve">  -D &lt;genome_name&gt; \</w:t>
+      </w:r>
+    </w:p>
+    <w:p>
+      <w:pPr>
+        <w:pStyle w:val="Normal"/>
+        <w:shd w:val="clear" w:fill="F2F2F2"/>
+        <w:spacing w:before="60" w:after="60"/>
+        <w:ind w:left="360"/>
+        <w:rPr/>
+      </w:pPr>
+      <w:r>
+        <w:rPr>
+          <w:rFonts w:eastAsia="Courier New" w:cs="Courier New" w:ascii="Courier New" w:hAnsi="Courier New"/>
+          <w:color w:val="1A1A1A"/>
+          <w:sz w:val="18"/>
+          <w:szCs w:val="18"/>
+        </w:rPr>
+        <w:t xml:space="preserve">  -t genome \</w:t>
+      </w:r>
+    </w:p>
+    <w:p>
+      <w:pPr>
+        <w:pStyle w:val="Normal"/>
+        <w:shd w:val="clear" w:fill="F2F2F2"/>
+        <w:spacing w:before="60" w:after="60"/>
+        <w:ind w:left="360"/>
+        <w:rPr/>
+      </w:pPr>
+      <w:r>
+        <w:rPr>
+          <w:rFonts w:eastAsia="Courier New" w:cs="Courier New" w:ascii="Courier New" w:hAnsi="Courier New"/>
+          <w:color w:val="1A1A1A"/>
+          <w:sz w:val="18"/>
+          <w:szCs w:val="18"/>
+        </w:rPr>
+        <w:t xml:space="preserve">  -i raw_reads_paired \</w:t>
+      </w:r>
+    </w:p>
+    <w:p>
+      <w:pPr>
+        <w:pStyle w:val="Normal"/>
+        <w:shd w:val="clear" w:fill="F2F2F2"/>
+        <w:spacing w:before="60" w:after="60"/>
+        <w:ind w:left="360"/>
+        <w:rPr/>
+      </w:pPr>
+      <w:r>
+        <w:rPr>
+          <w:rFonts w:eastAsia="Courier New" w:cs="Courier New" w:ascii="Courier New" w:hAnsi="Courier New"/>
+          <w:color w:val="1A1A1A"/>
+          <w:sz w:val="18"/>
+          <w:szCs w:val="18"/>
+        </w:rPr>
+        <w:t xml:space="preserve">  /path/to/reads_R1.fastq.gz \</w:t>
+      </w:r>
+    </w:p>
+    <w:p>
+      <w:pPr>
+        <w:pStyle w:val="Normal"/>
+        <w:shd w:val="clear" w:fill="F2F2F2"/>
+        <w:spacing w:before="60" w:after="60"/>
+        <w:ind w:left="360"/>
+        <w:rPr/>
+      </w:pPr>
+      <w:r>
+        <w:rPr>
+          <w:rFonts w:eastAsia="Courier New" w:cs="Courier New" w:ascii="Courier New" w:hAnsi="Courier New"/>
+          <w:color w:val="1A1A1A"/>
+          <w:sz w:val="18"/>
+          <w:szCs w:val="18"/>
+        </w:rPr>
+        <w:t xml:space="preserve">  /path/to/reads_R2.fastq.gz</w:t>
+      </w:r>
+    </w:p>
+    <w:p>
+      <w:pPr>
+        <w:pStyle w:val="Normal"/>
+        <w:spacing w:before="0" w:after="80"/>
+        <w:rPr/>
+      </w:pPr>
+      <w:r>
+        <w:rPr/>
+      </w:r>
+    </w:p>
+    <w:p>
+      <w:pPr>
+        <w:pStyle w:val="Normal"/>
+        <w:spacing w:before="120" w:after="60"/>
+        <w:rPr/>
+      </w:pPr>
+      <w:r>
+        <w:rPr>
+          <w:rFonts w:eastAsia="Arial" w:cs="Arial" w:ascii="Arial" w:hAnsi="Arial"/>
+          <w:b/>
+          <w:color w:val="1F5C99"/>
+          <w:sz w:val="22"/>
+          <w:szCs w:val="22"/>
+        </w:rPr>
+        <w:t>Key difference between input types</w:t>
+      </w:r>
+    </w:p>
+    <w:p>
+      <w:pPr>
+        <w:pStyle w:val="Normal"/>
+        <w:shd w:val="clear" w:fill="F2F2F2"/>
+        <w:spacing w:before="60" w:after="60"/>
+        <w:ind w:left="360"/>
+        <w:rPr/>
+      </w:pPr>
+      <w:r>
+        <w:rPr>
+          <w:rFonts w:eastAsia="Courier New" w:cs="Courier New" w:ascii="Courier New" w:hAnsi="Courier New"/>
+          <w:color w:val="1A1A1A"/>
+          <w:sz w:val="18"/>
+          <w:szCs w:val="18"/>
+        </w:rPr>
+        <w:t>Assembly input  (-i assembly)       → pipeline starts at 06.cds — fast</w:t>
+      </w:r>
+    </w:p>
+    <w:p>
+      <w:pPr>
+        <w:pStyle w:val="Normal"/>
+        <w:shd w:val="clear" w:fill="F2F2F2"/>
+        <w:spacing w:before="60" w:after="60"/>
+        <w:ind w:left="360"/>
+        <w:rPr/>
+      </w:pPr>
+      <w:r>
+        <w:rPr>
+          <w:rFonts w:eastAsia="Courier New" w:cs="Courier New" w:ascii="Courier New" w:hAnsi="Courier New"/>
+          <w:color w:val="1A1A1A"/>
+          <w:sz w:val="18"/>
+          <w:szCs w:val="18"/>
+        </w:rPr>
+        <w:t>Raw reads input (-i raw_reads_paired) → full pipeline from 01.raw_reads — slow</w:t>
+      </w:r>
+    </w:p>
+    <w:p>
+      <w:pPr>
+        <w:pStyle w:val="Normal"/>
+        <w:spacing w:before="0" w:after="80"/>
+        <w:rPr/>
+      </w:pPr>
+      <w:r>
+        <w:rPr/>
+      </w:r>
+    </w:p>
+    <w:p>
+      <w:pPr>
+        <w:pStyle w:val="Normal"/>
         <w:shd w:val="clear" w:fill="F2F2F2"/>
         <w:spacing w:before="60" w:after="60"/>
         <w:ind w:left="360"/>
@@ -5858,7 +5878,7 @@
           <w:sz w:val="18"/>
           <w:szCs w:val="18"/>
         </w:rPr>
-        <w:t>pixi run miga-cli ls -P &lt;project_name&gt;</w:t>
+        <w:t>pixi run miga-cli ls -P &lt;project_name&gt; | wc -l</w:t>
       </w:r>
     </w:p>
     <w:p>
@@ -5957,70 +5977,43 @@
           <w:sz w:val="18"/>
           <w:szCs w:val="18"/>
         </w:rPr>
-        <w:t xml:space="preserve">  </w:t>
-      </w:r>
-      <w:r>
-        <w:rPr>
-          <w:rFonts w:eastAsia="Courier New" w:cs="Courier New" w:ascii="Courier New" w:hAnsi="Courier New"/>
-          <w:color w:val="1A1A1A"/>
-          <w:sz w:val="18"/>
-          <w:szCs w:val="18"/>
-        </w:rPr>
-        <w:t>-P &lt;project_name&gt; \</w:t>
-      </w:r>
-    </w:p>
-    <w:p>
-      <w:pPr>
-        <w:pStyle w:val="Normal"/>
-        <w:shd w:val="clear" w:fill="F2F2F2"/>
-        <w:spacing w:before="60" w:after="60"/>
-        <w:ind w:left="360"/>
-        <w:rPr/>
-      </w:pPr>
-      <w:r>
-        <w:rPr>
-          <w:rFonts w:eastAsia="Courier New" w:cs="Courier New" w:ascii="Courier New" w:hAnsi="Courier New"/>
-          <w:color w:val="1A1A1A"/>
-          <w:sz w:val="18"/>
-          <w:szCs w:val="18"/>
-        </w:rPr>
-        <w:t xml:space="preserve">  </w:t>
-      </w:r>
-      <w:r>
-        <w:rPr>
-          <w:rFonts w:eastAsia="Courier New" w:cs="Courier New" w:ascii="Courier New" w:hAnsi="Courier New"/>
-          <w:color w:val="1A1A1A"/>
-          <w:sz w:val="18"/>
-          <w:szCs w:val="18"/>
-        </w:rPr>
-        <w:t>--shutdown-when-done \</w:t>
-      </w:r>
-    </w:p>
-    <w:p>
-      <w:pPr>
-        <w:pStyle w:val="Normal"/>
-        <w:shd w:val="clear" w:fill="F2F2F2"/>
-        <w:spacing w:before="60" w:after="60"/>
-        <w:ind w:left="360"/>
-        <w:rPr/>
-      </w:pPr>
-      <w:r>
-        <w:rPr>
-          <w:rFonts w:eastAsia="Courier New" w:cs="Courier New" w:ascii="Courier New" w:hAnsi="Courier New"/>
-          <w:color w:val="1A1A1A"/>
-          <w:sz w:val="18"/>
-          <w:szCs w:val="18"/>
-        </w:rPr>
-        <w:t xml:space="preserve">  </w:t>
-      </w:r>
-      <w:r>
-        <w:rPr>
-          <w:rFonts w:eastAsia="Courier New" w:cs="Courier New" w:ascii="Courier New" w:hAnsi="Courier New"/>
-          <w:color w:val="1A1A1A"/>
-          <w:sz w:val="18"/>
-          <w:szCs w:val="18"/>
-        </w:rPr>
-        <w:t>2&gt;&amp;1 | tee miga_daemon.log</w:t>
+        <w:t xml:space="preserve">  -P &lt;project_name&gt; \</w:t>
+      </w:r>
+    </w:p>
+    <w:p>
+      <w:pPr>
+        <w:pStyle w:val="Normal"/>
+        <w:shd w:val="clear" w:fill="F2F2F2"/>
+        <w:spacing w:before="60" w:after="60"/>
+        <w:ind w:left="360"/>
+        <w:rPr/>
+      </w:pPr>
+      <w:r>
+        <w:rPr>
+          <w:rFonts w:eastAsia="Courier New" w:cs="Courier New" w:ascii="Courier New" w:hAnsi="Courier New"/>
+          <w:color w:val="1A1A1A"/>
+          <w:sz w:val="18"/>
+          <w:szCs w:val="18"/>
+        </w:rPr>
+        <w:t xml:space="preserve">  --shutdown-when-done \</w:t>
+      </w:r>
+    </w:p>
+    <w:p>
+      <w:pPr>
+        <w:pStyle w:val="Normal"/>
+        <w:shd w:val="clear" w:fill="F2F2F2"/>
+        <w:spacing w:before="60" w:after="60"/>
+        <w:ind w:left="360"/>
+        <w:rPr/>
+      </w:pPr>
+      <w:r>
+        <w:rPr>
+          <w:rFonts w:eastAsia="Courier New" w:cs="Courier New" w:ascii="Courier New" w:hAnsi="Courier New"/>
+          <w:color w:val="1A1A1A"/>
+          <w:sz w:val="18"/>
+          <w:szCs w:val="18"/>
+        </w:rPr>
+        <w:t xml:space="preserve">  2&gt;&amp;1 | tee miga_daemon.log</w:t>
       </w:r>
     </w:p>
     <w:p>
@@ -6427,16 +6420,7 @@
           <w:sz w:val="20"/>
           <w:szCs w:val="20"/>
         </w:rPr>
-        <w:t xml:space="preserve">✓ </w:t>
-      </w:r>
-      <w:r>
-        <w:rPr>
-          <w:rFonts w:eastAsia="Arial" w:cs="Arial"/>
-          <w:color w:val="375623"/>
-          <w:sz w:val="20"/>
-          <w:szCs w:val="20"/>
-        </w:rPr>
-        <w:t>Tip: The daemon gives no visual feedback by design. Always monitor with the watch command above. Check pond_bin21_tree/daemon/MiGA:project.output for detailed logs.</w:t>
+        <w:t>✓ Tip: The daemon gives no visual feedback by design. Always monitor with the watch command above. Check pond_bin21_tree/daemon/MiGA:project.output for detailed logs.</w:t>
       </w:r>
     </w:p>
     <w:p>
@@ -6771,16 +6755,7 @@
           <w:sz w:val="20"/>
           <w:szCs w:val="20"/>
         </w:rPr>
-        <w:t xml:space="preserve">⚠ </w:t>
-      </w:r>
-      <w:r>
-        <w:rPr>
-          <w:rFonts w:eastAsia="Arial" w:cs="Arial"/>
-          <w:color w:val="7F6000"/>
-          <w:sz w:val="20"/>
-          <w:szCs w:val="20"/>
-        </w:rPr>
-        <w:t>Note: The ref-tree requires a completed daemon run with ref_project set. Running it on a classify_wf output directory will not work — classify_wf does not generate the .aai.db file in the required location.</w:t>
+        <w:t>⚠ Note: The ref-tree requires a completed daemon run with ref_project set. Running it on a classify_wf output directory will not work — classify_wf does not generate the .aai.db file in the required location.</w:t>
       </w:r>
     </w:p>
     <w:p>
@@ -6979,124 +6954,79 @@
           <w:sz w:val="18"/>
           <w:szCs w:val="18"/>
         </w:rPr>
-        <w:t xml:space="preserve">  </w:t>
-      </w:r>
-      <w:r>
-        <w:rPr>
-          <w:rFonts w:eastAsia="Courier New" w:cs="Courier New" w:ascii="Courier New" w:hAnsi="Courier New"/>
-          <w:color w:val="1A1A1A"/>
-          <w:sz w:val="18"/>
-          <w:szCs w:val="18"/>
-        </w:rPr>
-        <w:t>-P pond_bin21_tree \</w:t>
-      </w:r>
-    </w:p>
-    <w:p>
-      <w:pPr>
-        <w:pStyle w:val="Normal"/>
-        <w:shd w:val="clear" w:fill="F2F2F2"/>
-        <w:spacing w:before="60" w:after="60"/>
-        <w:ind w:left="360"/>
-        <w:rPr/>
-      </w:pPr>
-      <w:r>
-        <w:rPr>
-          <w:rFonts w:eastAsia="Courier New" w:cs="Courier New" w:ascii="Courier New" w:hAnsi="Courier New"/>
-          <w:color w:val="1A1A1A"/>
-          <w:sz w:val="18"/>
-          <w:szCs w:val="18"/>
-        </w:rPr>
-        <w:t xml:space="preserve">  </w:t>
-      </w:r>
-      <w:r>
-        <w:rPr>
-          <w:rFonts w:eastAsia="Courier New" w:cs="Courier New" w:ascii="Courier New" w:hAnsi="Courier New"/>
-          <w:color w:val="1A1A1A"/>
-          <w:sz w:val="18"/>
-          <w:szCs w:val="18"/>
-        </w:rPr>
-        <w:t>-D bin21 \</w:t>
-      </w:r>
-    </w:p>
-    <w:p>
-      <w:pPr>
-        <w:pStyle w:val="Normal"/>
-        <w:shd w:val="clear" w:fill="F2F2F2"/>
-        <w:spacing w:before="60" w:after="60"/>
-        <w:ind w:left="360"/>
-        <w:rPr/>
-      </w:pPr>
-      <w:r>
-        <w:rPr>
-          <w:rFonts w:eastAsia="Courier New" w:cs="Courier New" w:ascii="Courier New" w:hAnsi="Courier New"/>
-          <w:color w:val="1A1A1A"/>
-          <w:sz w:val="18"/>
-          <w:szCs w:val="18"/>
-        </w:rPr>
-        <w:t xml:space="preserve">  </w:t>
-      </w:r>
-      <w:r>
-        <w:rPr>
-          <w:rFonts w:eastAsia="Courier New" w:cs="Courier New" w:ascii="Courier New" w:hAnsi="Courier New"/>
-          <w:color w:val="1A1A1A"/>
-          <w:sz w:val="18"/>
-          <w:szCs w:val="18"/>
-        </w:rPr>
-        <w:t>-t genome \</w:t>
-      </w:r>
-    </w:p>
-    <w:p>
-      <w:pPr>
-        <w:pStyle w:val="Normal"/>
-        <w:shd w:val="clear" w:fill="F2F2F2"/>
-        <w:spacing w:before="60" w:after="60"/>
-        <w:ind w:left="360"/>
-        <w:rPr/>
-      </w:pPr>
-      <w:r>
-        <w:rPr>
-          <w:rFonts w:eastAsia="Courier New" w:cs="Courier New" w:ascii="Courier New" w:hAnsi="Courier New"/>
-          <w:color w:val="1A1A1A"/>
-          <w:sz w:val="18"/>
-          <w:szCs w:val="18"/>
-        </w:rPr>
-        <w:t xml:space="preserve">  </w:t>
-      </w:r>
-      <w:r>
-        <w:rPr>
-          <w:rFonts w:eastAsia="Courier New" w:cs="Courier New" w:ascii="Courier New" w:hAnsi="Courier New"/>
-          <w:color w:val="1A1A1A"/>
-          <w:sz w:val="18"/>
-          <w:szCs w:val="18"/>
-        </w:rPr>
-        <w:t>-i assembly \</w:t>
-      </w:r>
-    </w:p>
-    <w:p>
-      <w:pPr>
-        <w:pStyle w:val="Normal"/>
-        <w:shd w:val="clear" w:fill="F2F2F2"/>
-        <w:spacing w:before="60" w:after="60"/>
-        <w:ind w:left="360"/>
-        <w:rPr/>
-      </w:pPr>
-      <w:r>
-        <w:rPr>
-          <w:rFonts w:eastAsia="Courier New" w:cs="Courier New" w:ascii="Courier New" w:hAnsi="Courier New"/>
-          <w:color w:val="1A1A1A"/>
-          <w:sz w:val="18"/>
-          <w:szCs w:val="18"/>
-        </w:rPr>
-        <w:t xml:space="preserve">  </w:t>
-      </w:r>
-      <w:r>
-        <w:rPr>
-          <w:rFonts w:eastAsia="Courier New" w:cs="Courier New" w:ascii="Courier New" w:hAnsi="Courier New"/>
-          <w:color w:val="1A1A1A"/>
-          <w:sz w:val="18"/>
-          <w:szCs w:val="18"/>
-        </w:rPr>
-        <w:t>test_dram2/bin21_input/bin21.fasta</w:t>
+        <w:t xml:space="preserve">  -P pond_bin21_tree \</w:t>
+      </w:r>
+    </w:p>
+    <w:p>
+      <w:pPr>
+        <w:pStyle w:val="Normal"/>
+        <w:shd w:val="clear" w:fill="F2F2F2"/>
+        <w:spacing w:before="60" w:after="60"/>
+        <w:ind w:left="360"/>
+        <w:rPr/>
+      </w:pPr>
+      <w:r>
+        <w:rPr>
+          <w:rFonts w:eastAsia="Courier New" w:cs="Courier New" w:ascii="Courier New" w:hAnsi="Courier New"/>
+          <w:color w:val="1A1A1A"/>
+          <w:sz w:val="18"/>
+          <w:szCs w:val="18"/>
+        </w:rPr>
+        <w:t xml:space="preserve">  -D bin21 \</w:t>
+      </w:r>
+    </w:p>
+    <w:p>
+      <w:pPr>
+        <w:pStyle w:val="Normal"/>
+        <w:shd w:val="clear" w:fill="F2F2F2"/>
+        <w:spacing w:before="60" w:after="60"/>
+        <w:ind w:left="360"/>
+        <w:rPr/>
+      </w:pPr>
+      <w:r>
+        <w:rPr>
+          <w:rFonts w:eastAsia="Courier New" w:cs="Courier New" w:ascii="Courier New" w:hAnsi="Courier New"/>
+          <w:color w:val="1A1A1A"/>
+          <w:sz w:val="18"/>
+          <w:szCs w:val="18"/>
+        </w:rPr>
+        <w:t xml:space="preserve">  -t genome \</w:t>
+      </w:r>
+    </w:p>
+    <w:p>
+      <w:pPr>
+        <w:pStyle w:val="Normal"/>
+        <w:shd w:val="clear" w:fill="F2F2F2"/>
+        <w:spacing w:before="60" w:after="60"/>
+        <w:ind w:left="360"/>
+        <w:rPr/>
+      </w:pPr>
+      <w:r>
+        <w:rPr>
+          <w:rFonts w:eastAsia="Courier New" w:cs="Courier New" w:ascii="Courier New" w:hAnsi="Courier New"/>
+          <w:color w:val="1A1A1A"/>
+          <w:sz w:val="18"/>
+          <w:szCs w:val="18"/>
+        </w:rPr>
+        <w:t xml:space="preserve">  -i assembly \</w:t>
+      </w:r>
+    </w:p>
+    <w:p>
+      <w:pPr>
+        <w:pStyle w:val="Normal"/>
+        <w:shd w:val="clear" w:fill="F2F2F2"/>
+        <w:spacing w:before="60" w:after="60"/>
+        <w:ind w:left="360"/>
+        <w:rPr/>
+      </w:pPr>
+      <w:r>
+        <w:rPr>
+          <w:rFonts w:eastAsia="Courier New" w:cs="Courier New" w:ascii="Courier New" w:hAnsi="Courier New"/>
+          <w:color w:val="1A1A1A"/>
+          <w:sz w:val="18"/>
+          <w:szCs w:val="18"/>
+        </w:rPr>
+        <w:t xml:space="preserve">  test_dram2/bin21_input/bin21.fasta</w:t>
       </w:r>
     </w:p>
     <w:p>
@@ -8795,16 +8725,7 @@
           <w:sz w:val="20"/>
           <w:szCs w:val="20"/>
         </w:rPr>
-        <w:t xml:space="preserve">✓ </w:t>
-      </w:r>
-      <w:r>
-        <w:rPr>
-          <w:rFonts w:eastAsia="Arial" w:cs="Arial"/>
-          <w:color w:val="375623"/>
-          <w:sz w:val="20"/>
-          <w:szCs w:val="20"/>
-        </w:rPr>
-        <w:t>Tip: MiGA classify_wf and CompareM2/GTDB-Tk are complementary. MiGA uses gAAI-based classification against curated type material genomes. GTDB-Tk uses marker gene placement on a reference phylogeny. When both agree (as with bin.21 = Stutzerimonas), the classification is highly confident.</w:t>
+        <w:t>✓ Tip: MiGA classify_wf and CompareM2/GTDB-Tk are complementary. MiGA uses gAAI-based classification against curated type material genomes. GTDB-Tk uses marker gene placement on a reference phylogeny. When both agree (as with bin.21 = Stutzerimonas), the classification is highly confident.</w:t>
       </w:r>
     </w:p>
     <w:p>

</xml_diff>